<commit_message>
Clarify DeepAW to HALF workflow in feasibility report
</commit_message>
<xml_diff>
--- a/docs/reports/DeePAW_HALF_Technical_Feasibility_Study.docx
+++ b/docs/reports/DeePAW_HALF_Technical_Feasibility_Study.docx
@@ -28,12 +28,7 @@
         <w:spacing w:after="440"/>
       </w:pPr>
       <w:r>
-        <w:rPr>
-          <w:rFonts w:ascii="Arial" w:hAnsi="Arial"/>
-          <w:color w:val="373737"/>
-          <w:sz w:val="28"/>
-        </w:rPr>
-        <w:t>Independent fixed density electronic structure reconstruction and direct VASP initialization</w:t>
+        <w:t>Electronic structure reconstruction from DeepAW density and direct VASP initialization</w:t>
       </w:r>
     </w:p>
     <w:p>
@@ -54,7 +49,7 @@
         <w:spacing w:after="140"/>
       </w:pPr>
       <w:r>
-        <w:t>DeePAW-HALF is technically feasible for controlled use as a standalone fixed-density band and wavefunction generator and as an initializer for the validated VASP workflow. The numerical evidence supports a pilot deployment within the current collinear, full-complex scope. General production release should follow broader material coverage, additional parallel modes, and an in-memory density interface.</w:t>
+        <w:t>DeePAW-HALF is technically feasible for controlled use as a standalone band and wavefunction generator driven by DeepAW density and as an initializer for the validated VASP workflow. The numerical evidence supports a pilot deployment within the current collinear, full-complex scope. General production release should follow broader material coverage, additional parallel modes, and a direct in-memory DeepAW density interface.</w:t>
       </w:r>
     </w:p>
     <w:p>
@@ -116,7 +111,7 @@
         <w:spacing w:after="140"/>
       </w:pPr>
       <w:r>
-        <w:t>The strongest end-to-end evidence is the HfO2 validation. Standalone HALF and VASP produce visually coincident band dispersions on the same 100-point path. Their sampled band gaps differ by 0.557 meV, and their direct Gamma-point gaps differ by 2.661 meV. In VASP initialization tests, HALF reduces the electronic iteration count from 16 to 4 or 5 while preserving the converged energy within 2 x 10⁻⁵ eV per cell.</w:t>
+        <w:t>The strongest end-to-end evidence is the HfO2 validation. DeepAW generates the smooth density, and standalone HALF reconstructs and diagonalizes the PAW plane-wave operator without entering the VASP workflow. The resulting HALF and VASP band dispersions are visually coincident on the same 100-point path. Their sampled band gaps differ by 0.557 meV, and their direct Gamma-point gaps differ by 2.661 meV. In VASP initialization tests, HALF reduces the electronic iteration count from 16 to 4 or 5 while preserving the converged energy within 2 x 10⁻⁵ eV per cell.</w:t>
       </w:r>
     </w:p>
     <w:p>
@@ -715,7 +710,7 @@
         <w:spacing w:after="60"/>
       </w:pPr>
       <w:r>
-        <w:t>Fixed-density reconstruction from a smooth charge density and matching PAW dataset.</w:t>
+        <w:t>Fixed-density reconstruction from a DeepAW-generated smooth charge density and matching PAW dataset.</w:t>
       </w:r>
     </w:p>
     <w:p>
@@ -814,7 +809,7 @@
         <w:spacing w:after="140"/>
       </w:pPr>
       <w:r>
-        <w:t>HALF consumes the predicted or converged smooth density together with the matching PAW dataset. It reconstructs the local effective potential, plane-wave basis, PAW projectors, and augmentation terms. The resulting Hamiltonian and overlap operators are solved at requested k points. The density remains fixed; HALF does not run an SCF cycle.</w:t>
+        <w:t>HALF consumes the smooth density generated by DeepAW together with the matching PAW dataset. It reconstructs the local effective potential, plane-wave basis, PAW projectors, and augmentation terms. The resulting Hamiltonian and overlap operators are solved at requested k points. The density remains fixed; HALF does not run an SCF cycle.</w:t>
       </w:r>
     </w:p>
     <w:tbl>
@@ -1905,12 +1900,7 @@
         <w:jc w:val="center"/>
       </w:pPr>
       <w:r>
-        <w:rPr>
-          <w:i/>
-          <w:color w:val="464646"/>
-          <w:sz w:val="18"/>
-        </w:rPr>
-        <w:t>Figure 1  HfO2 band structure generated directly by standalone DeePAW-HALF</w:t>
+        <w:t>Figure 1  HfO2 band structure from the DeepAW and standalone DeePAW-HALF workflow</w:t>
       </w:r>
     </w:p>
     <w:p>
@@ -1959,7 +1949,7 @@
         <w:spacing w:after="140"/>
       </w:pPr>
       <w:r>
-        <w:t>The standalone calculation produces a sampled band gap of 4.576341 eV and a direct Gamma-point gap of 4.629091 eV. No VASP execution is required to obtain this result.</w:t>
+        <w:t>DeepAW supplies the smooth density and standalone HALF produces a sampled band gap of 4.576341 eV and a direct Gamma-point gap of 4.629091 eV. No VASP execution is required in this band-structure workflow.</w:t>
       </w:r>
     </w:p>
     <w:p>
@@ -1977,7 +1967,7 @@
         <w:spacing w:after="140"/>
       </w:pPr>
       <w:r>
-        <w:t>A separate VASP calculation was evaluated on the same 100 k points and with the same 60-band target. Each spectrum is referenced to its own valence-band maximum. The two dispersions overlap throughout the plotted valence and conduction regions.</w:t>
+        <w:t>A separate VASP calculation was evaluated on the same 100 k points and with the same 60-band target. Each spectrum is referenced to its own valence-band maximum. The DeepAW-HALF and VASP dispersions overlap throughout the plotted valence and conduction regions.</w:t>
       </w:r>
     </w:p>
     <w:p>
@@ -2409,7 +2399,7 @@
         <w:spacing w:after="140"/>
       </w:pPr>
       <w:r>
-        <w:t>This agreement is sufficient for the present feasibility decision. It shows that the standalone implementation reproduces the reference band topology and band gap for the tested HfO2 case, rather than only matching an internal HAPPY intermediate.</w:t>
+        <w:t>This agreement is sufficient for the present feasibility decision. It shows that the end-to-end DeepAW-HALF workflow reproduces the reference band topology and band gap for the tested HfO2 case, rather than only matching an internal HAPPY intermediate.</w:t>
       </w:r>
     </w:p>
     <w:p>
@@ -5005,7 +4995,7 @@
         <w:spacing w:after="140"/>
       </w:pPr>
       <w:r>
-        <w:t>DeePAW-HALF has passed the threshold for a controlled technical pilot. The implementation reproduces the fixed-density reference operator, generates standalone HfO2 bands that agree with VASP, improves VASP starting orbitals, and provides a credible CPU and GPU integration surface.</w:t>
+        <w:t>DeePAW-HALF has passed the threshold for a controlled technical pilot. The implementation reconstructs the fixed-density reference operator from DeepAW density, generates standalone HfO2 bands that agree with VASP, improves VASP starting orbitals, and provides a credible CPU and GPU integration surface.</w:t>
       </w:r>
     </w:p>
     <w:p>

</xml_diff>